<commit_message>
Fix voltaje: usar get_throttled, mostrar 5.0V OK o ⚠ VOLT según estado real
</commit_message>
<xml_diff>
--- a/Docs/TETRA_OLED_Manual_v3_3.docx
+++ b/Docs/TETRA_OLED_Manual_v3_3.docx
@@ -2506,7 +2506,7 @@
                 <w:sz w:val="20"/>
                 <w:szCs w:val="20"/>
               </w:rPr>
-              <w:t xml:space="preserve">│ 33.1C      5.0V OK  │  ← Temperatura y voltaje</w:t>
+              <w:t xml:space="preserve">│ 33.1°C     5.0V OK  │  ← Temperatura y estado alimentación</w:t>
             </w:r>
           </w:p>
           <w:p>
@@ -5654,6 +5654,627 @@
         <w:t xml:space="preserve">Tras cualquier cambio en el script, reinicia el servicio: sudo systemctl restart tetra-oled</w:t>
       </w:r>
     </w:p>
+    <w:p>
+      <w:pPr>
+        <w:spacing w:after="40" w:before="40"/>
+      </w:pPr>
+      <w:r>
+        <w:t xml:space="preserve"/>
+      </w:r>
+    </w:p>
+    <w:p>
+      <w:pPr>
+        <w:pStyle w:val="Heading1"/>
+        <w:spacing w:after="160" w:before="320"/>
+      </w:pPr>
+      <w:r>
+        <w:rPr>
+          <w:rFonts w:ascii="Arial" w:cs="Arial" w:eastAsia="Arial" w:hAnsi="Arial"/>
+          <w:b/>
+          <w:bCs/>
+          <w:color w:val="1F4E79"/>
+          <w:sz w:val="32"/>
+          <w:szCs w:val="32"/>
+        </w:rPr>
+        <w:t xml:space="preserve">11.  Historial de versiones</w:t>
+      </w:r>
+    </w:p>
+    <w:p>
+      <w:pPr>
+        <w:spacing w:after="60" w:before="60"/>
+      </w:pPr>
+      <w:r>
+        <w:rPr>
+          <w:rFonts w:ascii="Arial" w:cs="Arial" w:eastAsia="Arial" w:hAnsi="Arial"/>
+          <w:sz w:val="22"/>
+          <w:szCs w:val="22"/>
+        </w:rPr>
+        <w:t xml:space="preserve">Registro de cambios y mejoras por versión.</w:t>
+      </w:r>
+    </w:p>
+    <w:p>
+      <w:pPr>
+        <w:spacing w:after="40" w:before="40"/>
+      </w:pPr>
+      <w:r>
+        <w:t xml:space="preserve"/>
+      </w:r>
+    </w:p>
+    <w:tbl>
+      <w:tblPr>
+        <w:tblW w:type="dxa" w:w="9200"/>
+        <w:tblBorders>
+          <w:top w:val="single" w:color="auto" w:sz="4"/>
+          <w:left w:val="single" w:color="auto" w:sz="4"/>
+          <w:bottom w:val="single" w:color="auto" w:sz="4"/>
+          <w:right w:val="single" w:color="auto" w:sz="4"/>
+          <w:insideH w:val="single" w:color="auto" w:sz="4"/>
+          <w:insideV w:val="single" w:color="auto" w:sz="4"/>
+        </w:tblBorders>
+      </w:tblPr>
+      <w:tblGrid>
+        <w:gridCol w:w="1400"/>
+        <w:gridCol w:w="1400"/>
+        <w:gridCol w:w="6400"/>
+      </w:tblGrid>
+      <w:tr>
+        <w:trPr>
+          <w:tblHeader/>
+        </w:trPr>
+        <w:tc>
+          <w:tcPr>
+            <w:tcW w:type="dxa" w:w="1400"/>
+            <w:shd w:fill="2E75B6" w:val="clear"/>
+            <w:tcMar>
+              <w:top w:type="dxa" w:w="80"/>
+              <w:left w:type="dxa" w:w="120"/>
+              <w:bottom w:type="dxa" w:w="80"/>
+              <w:right w:type="dxa" w:w="120"/>
+            </w:tcMar>
+          </w:tcPr>
+          <w:p>
+            <w:r>
+              <w:rPr>
+                <w:rFonts w:ascii="Arial" w:cs="Arial" w:hAnsi="Arial"/>
+                <w:b/>
+                <w:color w:val="FFFFFF"/>
+                <w:sz w:val="20"/>
+              </w:rPr>
+              <w:t>Versión</w:t>
+            </w:r>
+          </w:p>
+        </w:tc>
+        <w:tc>
+          <w:tcPr>
+            <w:tcW w:type="dxa" w:w="1400"/>
+            <w:shd w:fill="2E75B6" w:val="clear"/>
+            <w:tcMar>
+              <w:top w:type="dxa" w:w="80"/>
+              <w:left w:type="dxa" w:w="120"/>
+              <w:bottom w:type="dxa" w:w="80"/>
+              <w:right w:type="dxa" w:w="120"/>
+            </w:tcMar>
+          </w:tcPr>
+          <w:p>
+            <w:r>
+              <w:rPr>
+                <w:rFonts w:ascii="Arial" w:cs="Arial" w:hAnsi="Arial"/>
+                <w:b/>
+                <w:color w:val="FFFFFF"/>
+                <w:sz w:val="20"/>
+              </w:rPr>
+              <w:t>Fecha</w:t>
+            </w:r>
+          </w:p>
+        </w:tc>
+        <w:tc>
+          <w:tcPr>
+            <w:tcW w:type="dxa" w:w="6400"/>
+            <w:shd w:fill="2E75B6" w:val="clear"/>
+            <w:tcMar>
+              <w:top w:type="dxa" w:w="80"/>
+              <w:left w:type="dxa" w:w="120"/>
+              <w:bottom w:type="dxa" w:w="80"/>
+              <w:right w:type="dxa" w:w="120"/>
+            </w:tcMar>
+          </w:tcPr>
+          <w:p>
+            <w:r>
+              <w:rPr>
+                <w:rFonts w:ascii="Arial" w:cs="Arial" w:hAnsi="Arial"/>
+                <w:b/>
+                <w:color w:val="FFFFFF"/>
+                <w:sz w:val="20"/>
+              </w:rPr>
+              <w:t>Cambios principales</w:t>
+            </w:r>
+          </w:p>
+        </w:tc>
+      </w:tr>
+      <w:tr>
+        <w:trPr>
+          <w:tblHeader w:val="false"/>
+        </w:trPr>
+        <w:tc>
+          <w:tcPr>
+            <w:tcW w:type="dxa" w:w="1400"/>
+            <w:shd w:fill="D9E8F5" w:val="clear"/>
+            <w:tcMar>
+              <w:top w:type="dxa" w:w="80"/>
+              <w:left w:type="dxa" w:w="120"/>
+              <w:bottom w:type="dxa" w:w="80"/>
+              <w:right w:type="dxa" w:w="120"/>
+            </w:tcMar>
+          </w:tcPr>
+          <w:p>
+            <w:r>
+              <w:rPr>
+                <w:rFonts w:ascii="Arial" w:cs="Arial" w:hAnsi="Arial"/>
+                <w:b/>
+                <w:sz w:val="20"/>
+              </w:rPr>
+              <w:t>3.3.1</w:t>
+            </w:r>
+          </w:p>
+        </w:tc>
+        <w:tc>
+          <w:tcPr>
+            <w:tcW w:type="dxa" w:w="1400"/>
+            <w:shd w:fill="D9E8F5" w:val="clear"/>
+            <w:tcMar>
+              <w:top w:type="dxa" w:w="80"/>
+              <w:left w:type="dxa" w:w="120"/>
+              <w:bottom w:type="dxa" w:w="80"/>
+              <w:right w:type="dxa" w:w="120"/>
+            </w:tcMar>
+          </w:tcPr>
+          <w:p>
+            <w:r>
+              <w:rPr>
+                <w:rFonts w:ascii="Arial" w:cs="Arial" w:hAnsi="Arial"/>
+                <w:sz w:val="20"/>
+              </w:rPr>
+              <w:t>May 2026</w:t>
+            </w:r>
+          </w:p>
+        </w:tc>
+        <w:tc>
+          <w:tcPr>
+            <w:tcW w:type="dxa" w:w="6400"/>
+            <w:shd w:fill="D9E8F5" w:val="clear"/>
+            <w:tcMar>
+              <w:top w:type="dxa" w:w="80"/>
+              <w:left w:type="dxa" w:w="120"/>
+              <w:bottom w:type="dxa" w:w="80"/>
+              <w:right w:type="dxa" w:w="120"/>
+            </w:tcMar>
+          </w:tcPr>
+          <w:p>
+            <w:r>
+              <w:rPr>
+                <w:rFonts w:ascii="Arial" w:cs="Arial" w:hAnsi="Arial"/>
+                <w:sz w:val="20"/>
+              </w:rPr>
+              <w:t>Voltaje: usa get_throttled (compatible todos los modelos). Muestra 5.0V OK o ⚠ VOLT según estado real. Añadida dependencia libopenjp2-7.</w:t>
+            </w:r>
+          </w:p>
+        </w:tc>
+      </w:tr>
+      <w:tr>
+        <w:trPr>
+          <w:tblHeader w:val="false"/>
+        </w:trPr>
+        <w:tc>
+          <w:tcPr>
+            <w:tcW w:type="dxa" w:w="1400"/>
+            <w:shd w:fill="F2F8FF" w:val="clear"/>
+            <w:tcMar>
+              <w:top w:type="dxa" w:w="80"/>
+              <w:left w:type="dxa" w:w="120"/>
+              <w:bottom w:type="dxa" w:w="80"/>
+              <w:right w:type="dxa" w:w="120"/>
+            </w:tcMar>
+          </w:tcPr>
+          <w:p>
+            <w:r>
+              <w:rPr>
+                <w:rFonts w:ascii="Arial" w:cs="Arial" w:hAnsi="Arial"/>
+                <w:b/>
+                <w:sz w:val="20"/>
+              </w:rPr>
+              <w:t>3.3.0</w:t>
+            </w:r>
+          </w:p>
+        </w:tc>
+        <w:tc>
+          <w:tcPr>
+            <w:tcW w:type="dxa" w:w="1400"/>
+            <w:shd w:fill="F2F8FF" w:val="clear"/>
+            <w:tcMar>
+              <w:top w:type="dxa" w:w="80"/>
+              <w:left w:type="dxa" w:w="120"/>
+              <w:bottom w:type="dxa" w:w="80"/>
+              <w:right w:type="dxa" w:w="120"/>
+            </w:tcMar>
+          </w:tcPr>
+          <w:p>
+            <w:r>
+              <w:rPr>
+                <w:rFonts w:ascii="Arial" w:cs="Arial" w:hAnsi="Arial"/>
+                <w:sz w:val="20"/>
+              </w:rPr>
+              <w:t>May 2026</w:t>
+            </w:r>
+          </w:p>
+        </w:tc>
+        <w:tc>
+          <w:tcPr>
+            <w:tcW w:type="dxa" w:w="6400"/>
+            <w:shd w:fill="F2F8FF" w:val="clear"/>
+            <w:tcMar>
+              <w:top w:type="dxa" w:w="80"/>
+              <w:left w:type="dxa" w:w="120"/>
+              <w:bottom w:type="dxa" w:w="80"/>
+              <w:right w:type="dxa" w:w="120"/>
+            </w:tcMar>
+          </w:tcPr>
+          <w:p>
+            <w:r>
+              <w:rPr>
+                <w:rFonts w:ascii="Arial" w:cs="Arial" w:hAnsi="Arial"/>
+                <w:sz w:val="20"/>
+              </w:rPr>
+              <w:t>Instalador pregunta usuario del sistema. Script de actualización (actualizar.sh). Compatible Pi 2B. Rutas dinámicas en servicio systemd. Fix CACHE_FILE y URL repo.</w:t>
+            </w:r>
+          </w:p>
+        </w:tc>
+      </w:tr>
+      <w:tr>
+        <w:trPr>
+          <w:tblHeader w:val="false"/>
+        </w:trPr>
+        <w:tc>
+          <w:tcPr>
+            <w:tcW w:type="dxa" w:w="1400"/>
+            <w:shd w:fill="F2F8FF" w:val="clear"/>
+            <w:tcMar>
+              <w:top w:type="dxa" w:w="80"/>
+              <w:left w:type="dxa" w:w="120"/>
+              <w:bottom w:type="dxa" w:w="80"/>
+              <w:right w:type="dxa" w:w="120"/>
+            </w:tcMar>
+          </w:tcPr>
+          <w:p>
+            <w:r>
+              <w:rPr>
+                <w:rFonts w:ascii="Arial" w:cs="Arial" w:hAnsi="Arial"/>
+                <w:b/>
+                <w:sz w:val="20"/>
+              </w:rPr>
+              <w:t>3.2.0</w:t>
+            </w:r>
+          </w:p>
+        </w:tc>
+        <w:tc>
+          <w:tcPr>
+            <w:tcW w:type="dxa" w:w="1400"/>
+            <w:shd w:fill="F2F8FF" w:val="clear"/>
+            <w:tcMar>
+              <w:top w:type="dxa" w:w="80"/>
+              <w:left w:type="dxa" w:w="120"/>
+              <w:bottom w:type="dxa" w:w="80"/>
+              <w:right w:type="dxa" w:w="120"/>
+            </w:tcMar>
+          </w:tcPr>
+          <w:p>
+            <w:r>
+              <w:rPr>
+                <w:rFonts w:ascii="Arial" w:cs="Arial" w:hAnsi="Arial"/>
+                <w:sz w:val="20"/>
+              </w:rPr>
+              <w:t>May 2026</w:t>
+            </w:r>
+          </w:p>
+        </w:tc>
+        <w:tc>
+          <w:tcPr>
+            <w:tcW w:type="dxa" w:w="6400"/>
+            <w:shd w:fill="F2F8FF" w:val="clear"/>
+            <w:tcMar>
+              <w:top w:type="dxa" w:w="80"/>
+              <w:left w:type="dxa" w:w="120"/>
+              <w:bottom w:type="dxa" w:w="80"/>
+              <w:right w:type="dxa" w:w="120"/>
+            </w:tcMar>
+          </w:tcPr>
+          <w:p>
+            <w:r>
+              <w:rPr>
+                <w:rFonts w:ascii="Arial" w:cs="Arial" w:hAnsi="Arial"/>
+                <w:sz w:val="20"/>
+              </w:rPr>
+              <w:t>Soporte pantalla SSD1327 1.5" 128x128 (escala de grises).</w:t>
+            </w:r>
+          </w:p>
+        </w:tc>
+      </w:tr>
+      <w:tr>
+        <w:trPr>
+          <w:tblHeader w:val="false"/>
+        </w:trPr>
+        <w:tc>
+          <w:tcPr>
+            <w:tcW w:type="dxa" w:w="1400"/>
+            <w:shd w:fill="F2F8FF" w:val="clear"/>
+            <w:tcMar>
+              <w:top w:type="dxa" w:w="80"/>
+              <w:left w:type="dxa" w:w="120"/>
+              <w:bottom w:type="dxa" w:w="80"/>
+              <w:right w:type="dxa" w:w="120"/>
+            </w:tcMar>
+          </w:tcPr>
+          <w:p>
+            <w:r>
+              <w:rPr>
+                <w:rFonts w:ascii="Arial" w:cs="Arial" w:hAnsi="Arial"/>
+                <w:b/>
+                <w:sz w:val="20"/>
+              </w:rPr>
+              <w:t>3.1.0</w:t>
+            </w:r>
+          </w:p>
+        </w:tc>
+        <w:tc>
+          <w:tcPr>
+            <w:tcW w:type="dxa" w:w="1400"/>
+            <w:shd w:fill="F2F8FF" w:val="clear"/>
+            <w:tcMar>
+              <w:top w:type="dxa" w:w="80"/>
+              <w:left w:type="dxa" w:w="120"/>
+              <w:bottom w:type="dxa" w:w="80"/>
+              <w:right w:type="dxa" w:w="120"/>
+            </w:tcMar>
+          </w:tcPr>
+          <w:p>
+            <w:r>
+              <w:rPr>
+                <w:rFonts w:ascii="Arial" w:cs="Arial" w:hAnsi="Arial"/>
+                <w:sz w:val="20"/>
+              </w:rPr>
+              <w:t>May 2026</w:t>
+            </w:r>
+          </w:p>
+        </w:tc>
+        <w:tc>
+          <w:tcPr>
+            <w:tcW w:type="dxa" w:w="6400"/>
+            <w:shd w:fill="F2F8FF" w:val="clear"/>
+            <w:tcMar>
+              <w:top w:type="dxa" w:w="80"/>
+              <w:left w:type="dxa" w:w="120"/>
+              <w:bottom w:type="dxa" w:w="80"/>
+              <w:right w:type="dxa" w:w="120"/>
+            </w:tcMar>
+          </w:tcPr>
+          <w:p>
+            <w:r>
+              <w:rPr>
+                <w:rFonts w:ascii="Arial" w:cs="Arial" w:hAnsi="Arial"/>
+                <w:sz w:val="20"/>
+              </w:rPr>
+              <w:t>Soporte pantalla SH1107 1.5" 128x128. Variable DISPLAY_TYPE y DISPLAY_ADDR.</w:t>
+            </w:r>
+          </w:p>
+        </w:tc>
+      </w:tr>
+      <w:tr>
+        <w:trPr>
+          <w:tblHeader w:val="false"/>
+        </w:trPr>
+        <w:tc>
+          <w:tcPr>
+            <w:tcW w:type="dxa" w:w="1400"/>
+            <w:shd w:fill="F2F8FF" w:val="clear"/>
+            <w:tcMar>
+              <w:top w:type="dxa" w:w="80"/>
+              <w:left w:type="dxa" w:w="120"/>
+              <w:bottom w:type="dxa" w:w="80"/>
+              <w:right w:type="dxa" w:w="120"/>
+            </w:tcMar>
+          </w:tcPr>
+          <w:p>
+            <w:r>
+              <w:rPr>
+                <w:rFonts w:ascii="Arial" w:cs="Arial" w:hAnsi="Arial"/>
+                <w:b/>
+                <w:sz w:val="20"/>
+              </w:rPr>
+              <w:t>3.0.0</w:t>
+            </w:r>
+          </w:p>
+        </w:tc>
+        <w:tc>
+          <w:tcPr>
+            <w:tcW w:type="dxa" w:w="1400"/>
+            <w:shd w:fill="F2F8FF" w:val="clear"/>
+            <w:tcMar>
+              <w:top w:type="dxa" w:w="80"/>
+              <w:left w:type="dxa" w:w="120"/>
+              <w:bottom w:type="dxa" w:w="80"/>
+              <w:right w:type="dxa" w:w="120"/>
+            </w:tcMar>
+          </w:tcPr>
+          <w:p>
+            <w:r>
+              <w:rPr>
+                <w:rFonts w:ascii="Arial" w:cs="Arial" w:hAnsi="Arial"/>
+                <w:sz w:val="20"/>
+              </w:rPr>
+              <w:t>May 2026</w:t>
+            </w:r>
+          </w:p>
+        </w:tc>
+        <w:tc>
+          <w:tcPr>
+            <w:tcW w:type="dxa" w:w="6400"/>
+            <w:shd w:fill="F2F8FF" w:val="clear"/>
+            <w:tcMar>
+              <w:top w:type="dxa" w:w="80"/>
+              <w:left w:type="dxa" w:w="120"/>
+              <w:bottom w:type="dxa" w:w="80"/>
+              <w:right w:type="dxa" w:w="120"/>
+            </w:tcMar>
+          </w:tcPr>
+          <w:p>
+            <w:r>
+              <w:rPr>
+                <w:rFonts w:ascii="Arial" w:cs="Arial" w:hAnsi="Arial"/>
+                <w:sz w:val="20"/>
+              </w:rPr>
+              <w:t>Modo journalctl y monitor. Llamadas de red en tiempo real. Prioridad de TG. Anti-quemado. Apagado automático. Servicio systemd.</w:t>
+            </w:r>
+          </w:p>
+        </w:tc>
+      </w:tr>
+      <w:tr>
+        <w:trPr>
+          <w:tblHeader w:val="false"/>
+        </w:trPr>
+        <w:tc>
+          <w:tcPr>
+            <w:tcW w:type="dxa" w:w="1400"/>
+            <w:shd w:fill="F2F8FF" w:val="clear"/>
+            <w:tcMar>
+              <w:top w:type="dxa" w:w="80"/>
+              <w:left w:type="dxa" w:w="120"/>
+              <w:bottom w:type="dxa" w:w="80"/>
+              <w:right w:type="dxa" w:w="120"/>
+            </w:tcMar>
+          </w:tcPr>
+          <w:p>
+            <w:r>
+              <w:rPr>
+                <w:rFonts w:ascii="Arial" w:cs="Arial" w:hAnsi="Arial"/>
+                <w:b/>
+                <w:sz w:val="20"/>
+              </w:rPr>
+              <w:t>2.0.0</w:t>
+            </w:r>
+          </w:p>
+        </w:tc>
+        <w:tc>
+          <w:tcPr>
+            <w:tcW w:type="dxa" w:w="1400"/>
+            <w:shd w:fill="F2F8FF" w:val="clear"/>
+            <w:tcMar>
+              <w:top w:type="dxa" w:w="80"/>
+              <w:left w:type="dxa" w:w="120"/>
+              <w:bottom w:type="dxa" w:w="80"/>
+              <w:right w:type="dxa" w:w="120"/>
+            </w:tcMar>
+          </w:tcPr>
+          <w:p>
+            <w:r>
+              <w:rPr>
+                <w:rFonts w:ascii="Arial" w:cs="Arial" w:hAnsi="Arial"/>
+                <w:sz w:val="20"/>
+              </w:rPr>
+              <w:t>May 2026</w:t>
+            </w:r>
+          </w:p>
+        </w:tc>
+        <w:tc>
+          <w:tcPr>
+            <w:tcW w:type="dxa" w:w="6400"/>
+            <w:shd w:fill="F2F8FF" w:val="clear"/>
+            <w:tcMar>
+              <w:top w:type="dxa" w:w="80"/>
+              <w:left w:type="dxa" w:w="120"/>
+              <w:bottom w:type="dxa" w:w="80"/>
+              <w:right w:type="dxa" w:w="120"/>
+            </w:tcMar>
+          </w:tcPr>
+          <w:p>
+            <w:r>
+              <w:rPr>
+                <w:rFonts w:ascii="Arial" w:cs="Arial" w:hAnsi="Arial"/>
+                <w:sz w:val="20"/>
+              </w:rPr>
+              <w:t>Pantalla standby con IP, temperatura, voltaje y hora. Base de datos radioid.net.</w:t>
+            </w:r>
+          </w:p>
+        </w:tc>
+      </w:tr>
+      <w:tr>
+        <w:trPr>
+          <w:tblHeader w:val="false"/>
+        </w:trPr>
+        <w:tc>
+          <w:tcPr>
+            <w:tcW w:type="dxa" w:w="1400"/>
+            <w:shd w:fill="F2F8FF" w:val="clear"/>
+            <w:tcMar>
+              <w:top w:type="dxa" w:w="80"/>
+              <w:left w:type="dxa" w:w="120"/>
+              <w:bottom w:type="dxa" w:w="80"/>
+              <w:right w:type="dxa" w:w="120"/>
+            </w:tcMar>
+          </w:tcPr>
+          <w:p>
+            <w:r>
+              <w:rPr>
+                <w:rFonts w:ascii="Arial" w:cs="Arial" w:hAnsi="Arial"/>
+                <w:b/>
+                <w:sz w:val="20"/>
+              </w:rPr>
+              <w:t>1.0.0</w:t>
+            </w:r>
+          </w:p>
+        </w:tc>
+        <w:tc>
+          <w:tcPr>
+            <w:tcW w:type="dxa" w:w="1400"/>
+            <w:shd w:fill="F2F8FF" w:val="clear"/>
+            <w:tcMar>
+              <w:top w:type="dxa" w:w="80"/>
+              <w:left w:type="dxa" w:w="120"/>
+              <w:bottom w:type="dxa" w:w="80"/>
+              <w:right w:type="dxa" w:w="120"/>
+            </w:tcMar>
+          </w:tcPr>
+          <w:p>
+            <w:r>
+              <w:rPr>
+                <w:rFonts w:ascii="Arial" w:cs="Arial" w:hAnsi="Arial"/>
+                <w:sz w:val="20"/>
+              </w:rPr>
+              <w:t>May 2026</w:t>
+            </w:r>
+          </w:p>
+        </w:tc>
+        <w:tc>
+          <w:tcPr>
+            <w:tcW w:type="dxa" w:w="6400"/>
+            <w:shd w:fill="F2F8FF" w:val="clear"/>
+            <w:tcMar>
+              <w:top w:type="dxa" w:w="80"/>
+              <w:left w:type="dxa" w:w="120"/>
+              <w:bottom w:type="dxa" w:w="80"/>
+              <w:right w:type="dxa" w:w="120"/>
+            </w:tcMar>
+          </w:tcPr>
+          <w:p>
+            <w:r>
+              <w:rPr>
+                <w:rFonts w:ascii="Arial" w:cs="Arial" w:hAnsi="Arial"/>
+                <w:sz w:val="20"/>
+              </w:rPr>
+              <w:t>Versión inicial. Pantalla SSD1306. Voz local, SDS local, radioid.net.</w:t>
+            </w:r>
+          </w:p>
+        </w:tc>
+      </w:tr>
+    </w:tbl>
     <w:p>
       <w:pPr>
         <w:spacing w:after="40" w:before="40"/>

</xml_diff>